<commit_message>
fix(manuscript): use p_\text{adj} in abstract to prevent line-height inflation in PDF and Word
</commit_message>
<xml_diff>
--- a/manuscript/paper_a_primary_unesco.docx
+++ b/manuscript/paper_a_primary_unesco.docx
@@ -277,13 +277,7 @@
         </m:r>
       </m:oMath>
       <w:r>
-        <w:t xml:space="preserve">) show 12.2%</w:t>
-      </w:r>
-      <w:r>
-        <w:t xml:space="preserve"> </w:t>
-      </w:r>
-      <w:r>
-        <w:t xml:space="preserve">Tier-A+ (permutation</w:t>
+        <w:t xml:space="preserve">) show 12.2% Tier-A+ (permutation</w:t>
       </w:r>
       <w:r>
         <w:t xml:space="preserve"> </w:t>
@@ -323,13 +317,7 @@
         </m:r>
       </m:oMath>
       <w:r>
-        <w:t xml:space="preserve">;</w:t>
-      </w:r>
-      <w:r>
-        <w:t xml:space="preserve"> </w:t>
-      </w:r>
-      <w:r>
-        <w:t xml:space="preserve">Bonferroni</w:t>
+        <w:t xml:space="preserve">; Bonferroni</w:t>
       </w:r>
       <w:r>
         <w:t xml:space="preserve"> </w:t>
@@ -344,21 +332,10 @@
           <m:sub>
             <m:r>
               <m:rPr>
+                <m:nor/>
                 <m:sty m:val="p"/>
               </m:rPr>
-              <m:t>a</m:t>
-            </m:r>
-            <m:r>
-              <m:rPr>
-                <m:sty m:val="p"/>
-              </m:rPr>
-              <m:t>d</m:t>
-            </m:r>
-            <m:r>
-              <m:rPr>
-                <m:sty m:val="p"/>
-              </m:rPr>
-              <m:t>j</m:t>
+              <m:t>adj</m:t>
             </m:r>
           </m:sub>
         </m:sSub>
@@ -393,13 +370,7 @@
         </m:r>
       </m:oMath>
       <w:r>
-        <w:t xml:space="preserve">).</w:t>
-      </w:r>
-      <w:r>
-        <w:t xml:space="preserve"> </w:t>
-      </w:r>
-      <w:r>
-        <w:t xml:space="preserve">A+-bearing harmonics host</w:t>
+        <w:t xml:space="preserve">). A+-bearing harmonics host</w:t>
       </w:r>
       <w:r>
         <w:t xml:space="preserve"> </w:t>
@@ -419,13 +390,7 @@
         <w:t xml:space="preserve"> </w:t>
       </w:r>
       <w:r>
-        <w:t xml:space="preserve">more total sites</w:t>
-      </w:r>
-      <w:r>
-        <w:t xml:space="preserve"> </w:t>
-      </w:r>
-      <w:r>
-        <w:t xml:space="preserve">than non-A+-bearing harmonics (permutation</w:t>
+        <w:t xml:space="preserve">more total sites than non-A+-bearing harmonics (permutation</w:t>
       </w:r>
       <w:r>
         <w:t xml:space="preserve"> </w:t>
@@ -445,13 +410,7 @@
         </m:r>
       </m:oMath>
       <w:r>
-        <w:t xml:space="preserve">).</w:t>
-      </w:r>
-      <w:r>
-        <w:t xml:space="preserve"> </w:t>
-      </w:r>
-      <w:r>
-        <w:t xml:space="preserve">Leave-one-out checks confirm no single site drives either result.</w:t>
+        <w:t xml:space="preserve">). Leave-one-out checks confirm no single site drives either result.</w:t>
       </w:r>
     </w:p>
     <w:p>
@@ -524,32 +483,6 @@
     <w:p>
       <w:pPr>
         <w:pStyle w:val="FirstParagraph"/>
-      </w:pPr>
-      <w:r>
-        <w:t xml:space="preserve">© 2026 Seth Tenenbaum.</w:t>
-      </w:r>
-      <w:r>
-        <w:t xml:space="preserve"> </w:t>
-      </w:r>
-      <w:r>
-        <w:t xml:space="preserve">Manuscript text and figures: CC BY 4.0.</w:t>
-      </w:r>
-      <w:r>
-        <w:t xml:space="preserve"> </w:t>
-      </w:r>
-      <w:r>
-        <w:t xml:space="preserve">Code: MIT License.</w:t>
-      </w:r>
-      <w:r>
-        <w:t xml:space="preserve"> </w:t>
-      </w:r>
-      <w:r>
-        <w:t xml:space="preserve">Data: UNESCO XML © UNESCO (research use); Wikidata extracts: CC0.</w:t>
-      </w:r>
-    </w:p>
-    <w:p>
-      <w:pPr>
-        <w:pStyle w:val="BodyText"/>
       </w:pPr>
       <w:r>
         <w:rPr>

</xml_diff>

<commit_message>
revert(manuscript): restore original copyright block and p_\mathrm{adj} in abstract
</commit_message>
<xml_diff>
--- a/manuscript/paper_a_primary_unesco.docx
+++ b/manuscript/paper_a_primary_unesco.docx
@@ -277,7 +277,13 @@
         </m:r>
       </m:oMath>
       <w:r>
-        <w:t xml:space="preserve">) show 12.2% Tier-A+ (permutation</w:t>
+        <w:t xml:space="preserve">) show 12.2%</w:t>
+      </w:r>
+      <w:r>
+        <w:t xml:space="preserve"> </w:t>
+      </w:r>
+      <w:r>
+        <w:t xml:space="preserve">Tier-A+ (permutation</w:t>
       </w:r>
       <w:r>
         <w:t xml:space="preserve"> </w:t>
@@ -317,7 +323,13 @@
         </m:r>
       </m:oMath>
       <w:r>
-        <w:t xml:space="preserve">; Bonferroni</w:t>
+        <w:t xml:space="preserve">;</w:t>
+      </w:r>
+      <w:r>
+        <w:t xml:space="preserve"> </w:t>
+      </w:r>
+      <w:r>
+        <w:t xml:space="preserve">Bonferroni</w:t>
       </w:r>
       <w:r>
         <w:t xml:space="preserve"> </w:t>
@@ -332,10 +344,21 @@
           <m:sub>
             <m:r>
               <m:rPr>
-                <m:nor/>
                 <m:sty m:val="p"/>
               </m:rPr>
-              <m:t>adj</m:t>
+              <m:t>a</m:t>
+            </m:r>
+            <m:r>
+              <m:rPr>
+                <m:sty m:val="p"/>
+              </m:rPr>
+              <m:t>d</m:t>
+            </m:r>
+            <m:r>
+              <m:rPr>
+                <m:sty m:val="p"/>
+              </m:rPr>
+              <m:t>j</m:t>
             </m:r>
           </m:sub>
         </m:sSub>
@@ -370,7 +393,13 @@
         </m:r>
       </m:oMath>
       <w:r>
-        <w:t xml:space="preserve">). A+-bearing harmonics host</w:t>
+        <w:t xml:space="preserve">).</w:t>
+      </w:r>
+      <w:r>
+        <w:t xml:space="preserve"> </w:t>
+      </w:r>
+      <w:r>
+        <w:t xml:space="preserve">A+-bearing harmonics host</w:t>
       </w:r>
       <w:r>
         <w:t xml:space="preserve"> </w:t>
@@ -390,7 +419,13 @@
         <w:t xml:space="preserve"> </w:t>
       </w:r>
       <w:r>
-        <w:t xml:space="preserve">more total sites than non-A+-bearing harmonics (permutation</w:t>
+        <w:t xml:space="preserve">more total sites</w:t>
+      </w:r>
+      <w:r>
+        <w:t xml:space="preserve"> </w:t>
+      </w:r>
+      <w:r>
+        <w:t xml:space="preserve">than non-A+-bearing harmonics (permutation</w:t>
       </w:r>
       <w:r>
         <w:t xml:space="preserve"> </w:t>
@@ -410,7 +445,13 @@
         </m:r>
       </m:oMath>
       <w:r>
-        <w:t xml:space="preserve">). Leave-one-out checks confirm no single site drives either result.</w:t>
+        <w:t xml:space="preserve">).</w:t>
+      </w:r>
+      <w:r>
+        <w:t xml:space="preserve"> </w:t>
+      </w:r>
+      <w:r>
+        <w:t xml:space="preserve">Leave-one-out checks confirm no single site drives either result.</w:t>
       </w:r>
     </w:p>
     <w:p>
@@ -483,6 +524,32 @@
     <w:p>
       <w:pPr>
         <w:pStyle w:val="FirstParagraph"/>
+      </w:pPr>
+      <w:r>
+        <w:t xml:space="preserve">© 2026 Seth Tenenbaum.</w:t>
+      </w:r>
+      <w:r>
+        <w:t xml:space="preserve"> </w:t>
+      </w:r>
+      <w:r>
+        <w:t xml:space="preserve">Manuscript text and figures: CC BY 4.0.</w:t>
+      </w:r>
+      <w:r>
+        <w:t xml:space="preserve"> </w:t>
+      </w:r>
+      <w:r>
+        <w:t xml:space="preserve">Code: MIT License.</w:t>
+      </w:r>
+      <w:r>
+        <w:t xml:space="preserve"> </w:t>
+      </w:r>
+      <w:r>
+        <w:t xml:space="preserve">Data: UNESCO XML © UNESCO (research use); Wikidata extracts: CC0.</w:t>
+      </w:r>
+    </w:p>
+    <w:p>
+      <w:pPr>
+        <w:pStyle w:val="BodyText"/>
       </w:pPr>
       <w:r>
         <w:rPr>

</xml_diff>